<commit_message>
Update Mietbewerbung page: hero CTAs, photo crop, Unterlagen
- Add E-Mail, Telefon, WhatsApp with icons; improve mobile hero image framing
- Trim Über uns (remove duplicate Kontakt/Referenzen); remove Direkter Kontakt
- Link Anschreiben to Cover Letter PDF; include updated cover letter assets

Made-with: Cursor
</commit_message>
<xml_diff>
--- a/0_Cover_Letter_Beuchat.docx
+++ b/0_Cover_Letter_Beuchat.docx
@@ -77,14 +77,12 @@
         </w:rPr>
         <w:t xml:space="preserve"> 54D</w:t>
       </w:r>
-    </w:p>
-    <w:p>
-      <w:pPr>
-        <w:spacing w:after="120"/>
+      <w:r>
         <w:rPr>
           <w:lang w:val="fr-CH"/>
         </w:rPr>
-      </w:pPr>
+        <w:t xml:space="preserve">, </w:t>
+      </w:r>
       <w:r>
         <w:rPr>
           <w:rFonts w:ascii="Calibri" w:hAnsi="Calibri"/>
@@ -116,14 +114,13 @@
         </w:rPr>
         <w:t>+41 78 913 22 44</w:t>
       </w:r>
-    </w:p>
-    <w:p>
-      <w:pPr>
-        <w:spacing w:after="120"/>
+      <w:r>
         <w:rPr>
+          <w:rFonts w:ascii="Calibri" w:hAnsi="Calibri"/>
           <w:lang w:val="de-CH"/>
         </w:rPr>
-      </w:pPr>
+        <w:t xml:space="preserve">, </w:t>
+      </w:r>
       <w:r>
         <w:rPr>
           <w:rFonts w:ascii="Calibri" w:hAnsi="Calibri"/>
@@ -148,8 +145,10 @@
     </w:p>
     <w:p>
       <w:pPr>
-        <w:spacing w:after="240"/>
+        <w:spacing w:after="120"/>
         <w:rPr>
+          <w:b/>
+          <w:sz w:val="28"/>
           <w:lang w:val="de-CH"/>
         </w:rPr>
       </w:pPr>
@@ -159,7 +158,7 @@
           <w:sz w:val="28"/>
           <w:lang w:val="de-CH"/>
         </w:rPr>
-        <w:t>Bewerbung für das Einfamilienhaus in Küsnacht</w:t>
+        <w:t>Bewerbung für ein Einfamilienhaus / eine Familienwohnung in Zürich und Umgebung</w:t>
       </w:r>
     </w:p>
     <w:p>
@@ -167,6 +166,7 @@
         <w:spacing w:after="120"/>
         <w:rPr>
           <w:rFonts w:ascii="Calibri" w:hAnsi="Calibri"/>
+          <w:lang w:val="de-CH"/>
         </w:rPr>
       </w:pPr>
     </w:p>
@@ -174,182 +174,114 @@
       <w:pPr>
         <w:spacing w:after="120"/>
         <w:rPr>
+          <w:rFonts w:ascii="Calibri" w:hAnsi="Calibri"/>
           <w:lang w:val="de-CH"/>
+        </w:rPr>
+      </w:pPr>
+    </w:p>
+    <w:p>
+      <w:pPr>
+        <w:spacing w:after="120"/>
+        <w:rPr>
+          <w:lang w:val="en-CH"/>
         </w:rPr>
       </w:pPr>
       <w:r>
         <w:rPr>
-          <w:rFonts w:ascii="Calibri" w:hAnsi="Calibri"/>
-          <w:lang w:val="de-CH"/>
+          <w:lang w:val="en-CH"/>
         </w:rPr>
-        <w:t>Sehr geehrte Frau Nigg,</w:t>
+        <w:t>Sehr geehrte Damen und Herren,</w:t>
       </w:r>
     </w:p>
     <w:p>
       <w:pPr>
         <w:spacing w:after="120"/>
         <w:rPr>
-          <w:lang w:val="de-CH"/>
+          <w:lang w:val="en-CH"/>
+        </w:rPr>
+      </w:pPr>
+    </w:p>
+    <w:p>
+      <w:pPr>
+        <w:spacing w:after="120"/>
+        <w:rPr>
+          <w:lang w:val="en-CH"/>
         </w:rPr>
       </w:pPr>
       <w:r>
         <w:rPr>
-          <w:rFonts w:ascii="Calibri" w:hAnsi="Calibri"/>
-          <w:lang w:val="de-CH"/>
+          <w:lang w:val="en-CH"/>
         </w:rPr>
-        <w:t>wir sind eine fünfköpfige Schweizer Familie und planen aufgrund beruflicher und familiärer Gründe die Rückkehr in die Region Zürich per Mitte Juli 2026.</w:t>
+        <w:t>W</w:t>
+      </w:r>
+      <w:r>
+        <w:rPr>
+          <w:lang w:val="en-CH"/>
+        </w:rPr>
+        <w:t>ir sind eine fünfköpfige Schweizer Familie und planen aufgrund beruflicher und familiärer Gründe die Rückkehr nach Zürich per Mitte Juli 2026.</w:t>
       </w:r>
     </w:p>
     <w:p>
       <w:pPr>
         <w:spacing w:after="120"/>
         <w:rPr>
-          <w:lang w:val="de-CH"/>
+          <w:lang w:val="en-CH"/>
         </w:rPr>
       </w:pPr>
       <w:r>
         <w:rPr>
-          <w:rFonts w:ascii="Calibri" w:hAnsi="Calibri"/>
-          <w:lang w:val="de-CH"/>
+          <w:lang w:val="en-CH"/>
         </w:rPr>
-        <w:t xml:space="preserve">Ich bin Managing </w:t>
-      </w:r>
-      <w:proofErr w:type="spellStart"/>
-      <w:r>
-        <w:rPr>
-          <w:rFonts w:ascii="Calibri" w:hAnsi="Calibri"/>
-          <w:lang w:val="de-CH"/>
-        </w:rPr>
-        <w:t>Director</w:t>
-      </w:r>
-      <w:proofErr w:type="spellEnd"/>
-      <w:r>
-        <w:rPr>
-          <w:rFonts w:ascii="Calibri" w:hAnsi="Calibri"/>
-          <w:lang w:val="de-CH"/>
-        </w:rPr>
-        <w:t xml:space="preserve"> bei UBS im Management Team, und meine Ehefrau, Dr. med. Léa Hochstrasser </w:t>
-      </w:r>
-      <w:proofErr w:type="spellStart"/>
-      <w:r>
-        <w:rPr>
-          <w:rFonts w:ascii="Calibri" w:hAnsi="Calibri"/>
-          <w:lang w:val="de-CH"/>
-        </w:rPr>
-        <w:t>Beuchat</w:t>
-      </w:r>
-      <w:proofErr w:type="spellEnd"/>
-      <w:r>
-        <w:rPr>
-          <w:rFonts w:ascii="Calibri" w:hAnsi="Calibri"/>
-          <w:lang w:val="de-CH"/>
-        </w:rPr>
-        <w:t xml:space="preserve">, ist Kinderärztin. Sie hat die Praxis „Kinderärzte Zollikon“ aufgebaut und erfolgreich an </w:t>
-      </w:r>
-      <w:proofErr w:type="spellStart"/>
-      <w:r>
-        <w:rPr>
-          <w:rFonts w:ascii="Calibri" w:hAnsi="Calibri"/>
-          <w:lang w:val="de-CH"/>
-        </w:rPr>
-        <w:t>Monvia</w:t>
-      </w:r>
-      <w:proofErr w:type="spellEnd"/>
-      <w:r>
-        <w:rPr>
-          <w:rFonts w:ascii="Calibri" w:hAnsi="Calibri"/>
-          <w:lang w:val="de-CH"/>
-        </w:rPr>
-        <w:t xml:space="preserve"> übergeben und verfügt über eine ausgezeichnete Vernetzung und Reputation in der Region Zürich sowie am Kinderspital. Sie freut sich darauf, ihre Tätigkeit in Zürich wieder aufzunehmen.</w:t>
+        <w:t>Ich bin Managing Director bei UBS im Management Team, und meine Ehefrau, Dr. med. Léa Hochstrasser Beuchat, ist Kinderärztin. Sie hat die Praxis „Kinderärzte Zollikon“ aufgebaut und erfolgreich an Monvia übergeben und verfügt über eine ausgezeichnete Vernetzung und Reputation in der Region Zürich sowie am Kinderspital. Sie freut sich darauf, ihre Tätigkeit in Zürich wieder aufzunehmen.</w:t>
       </w:r>
     </w:p>
     <w:p>
       <w:pPr>
         <w:spacing w:after="120"/>
         <w:rPr>
-          <w:lang w:val="de-CH"/>
+          <w:lang w:val="en-CH"/>
         </w:rPr>
       </w:pPr>
       <w:r>
         <w:rPr>
-          <w:rFonts w:ascii="Calibri" w:hAnsi="Calibri"/>
-          <w:lang w:val="de-CH"/>
+          <w:lang w:val="en-CH"/>
         </w:rPr>
-        <w:t>Wir haben drei Kinder (12, 7 und 7 Jahre alt) und suchen ein langfristiges Zuhause in einer ruhigen, familienfreundlichen Umgebung. Küsnacht spricht uns besonders an, da wir bereits über ein soziales Umfeld vor Ort verfügen und unsere Kinder dort zur Schule gehen werden.</w:t>
+        <w:t>Wir haben drei Kinder (12, 7 und 7 Jahre alt) und suchen ein langfristiges Zuhause in Zürich oder in gut angebundenen, familienfreundlichen Wohnlagen</w:t>
+      </w:r>
+      <w:r>
+        <w:rPr>
+          <w:lang w:val="en-CH"/>
+        </w:rPr>
+        <w:t>.</w:t>
       </w:r>
     </w:p>
     <w:p>
       <w:pPr>
         <w:spacing w:after="120"/>
         <w:rPr>
-          <w:lang w:val="de-CH"/>
+          <w:lang w:val="en-CH"/>
         </w:rPr>
       </w:pPr>
       <w:r>
         <w:rPr>
-          <w:rFonts w:ascii="Calibri" w:hAnsi="Calibri"/>
-          <w:lang w:val="de-CH"/>
+          <w:lang w:val="en-CH"/>
         </w:rPr>
-        <w:t>Das von Ihnen angebotene Haus entspricht genau unseren Vorstellungen eines langfristigen Familienwohnortes. Wir legen grossen Wert auf ein gepflegtes Zuhause, ein respektvolles nachbarschaftliches Umfeld sowie ein stabiles und langfristiges Mietverhältnis.</w:t>
+        <w:t>Das von Ihnen angebotene Objekt spricht uns aufgrund seiner Lage, Qualität und Eignung für eine Familie besonders an. Wir legen grossen Wert auf ein gepflegtes Zuhause, ein ruhiges und respektvolles nachbarschaftliches Umfeld sowie ein stabiles Mietverhältnis. Selbstverständlich behandeln wir die Liegenschaft mit grosser Sorgfalt, als wäre es unser eigenes Zuhause.</w:t>
       </w:r>
     </w:p>
     <w:p>
       <w:pPr>
         <w:spacing w:after="120"/>
         <w:rPr>
-          <w:lang w:val="de-CH"/>
+          <w:lang w:val="en-CH"/>
         </w:rPr>
       </w:pPr>
       <w:r>
         <w:rPr>
-          <w:rFonts w:ascii="Calibri" w:hAnsi="Calibri"/>
-          <w:lang w:val="de-CH"/>
+          <w:lang w:val="en-CH"/>
         </w:rPr>
-        <w:t>Wir sind finanziell sehr stabil aufgestellt und bereit, den Mietprozess effizient und unkompliziert voranzutreiben.</w:t>
+        <w:t>Wir sind finanziell sehr stabil aufgestellt und stehen für eine jederzeit zuverlässige und unkomplizierte Zusammenarbeit. Einzugstermin ist flexibel gestaltbar, und wir sind an einer langfristigen Lösung interessiert.</w:t>
       </w:r>
-    </w:p>
-    <w:p>
-      <w:pPr>
-        <w:spacing w:after="120"/>
-        <w:rPr>
-          <w:lang w:val="de-CH"/>
-        </w:rPr>
-      </w:pPr>
-      <w:r>
-        <w:rPr>
-          <w:rFonts w:ascii="Calibri" w:hAnsi="Calibri"/>
-        </w:rPr>
-        <w:t>📎</w:t>
-      </w:r>
-      <w:r>
-        <w:rPr>
-          <w:rFonts w:ascii="Calibri" w:hAnsi="Calibri"/>
-          <w:lang w:val="de-CH"/>
-        </w:rPr>
-        <w:t xml:space="preserve"> Vollständiges Bewerbungsdossier (inkl. Nachweise) über QR-Code abrufbar</w:t>
-      </w:r>
-    </w:p>
-    <w:p>
-      <w:pPr>
-        <w:spacing w:after="120"/>
-        <w:rPr>
-          <w:lang w:val="de-CH"/>
-        </w:rPr>
-      </w:pPr>
-      <w:r>
-        <w:rPr>
-          <w:rFonts w:ascii="Calibri" w:hAnsi="Calibri"/>
-          <w:lang w:val="de-CH"/>
-        </w:rPr>
-        <w:t>Wir freuen uns sehr, das Haus heute persönlich besichtigen zu dürfen, und sind bei Interesse gerne bereit, den Mietprozess effizient und unkompliziert voranzutreiben. Für weitere Informationen stehen wir jederzeit zur Verfügung.</w:t>
-      </w:r>
-    </w:p>
-    <w:p>
-      <w:pPr>
-        <w:rPr>
-          <w:lang w:val="de-CH"/>
-        </w:rPr>
-      </w:pPr>
     </w:p>
     <w:p>
       <w:pPr>
@@ -359,19 +291,43 @@
       </w:pPr>
       <w:r>
         <w:rPr>
+          <w:lang w:val="en-CH"/>
+        </w:rPr>
+        <w:t>Wir freuen uns sehr über die Möglichkeit einer Besichtigung und stehen für weitere Informationen jederzeit gerne zur Verfügung.</w:t>
+      </w:r>
+    </w:p>
+    <w:p>
+      <w:pPr>
+        <w:spacing w:after="120"/>
+        <w:rPr>
+          <w:rFonts w:ascii="Calibri" w:hAnsi="Calibri"/>
+          <w:lang w:val="de-CH"/>
+        </w:rPr>
+      </w:pPr>
+    </w:p>
+    <w:p>
+      <w:pPr>
+        <w:spacing w:after="120"/>
+        <w:rPr>
+          <w:rFonts w:ascii="Calibri" w:hAnsi="Calibri"/>
+          <w:lang w:val="de-CH"/>
+        </w:rPr>
+      </w:pPr>
+      <w:r>
+        <w:rPr>
           <w:noProof/>
           <w:lang w:val="de-CH"/>
         </w:rPr>
         <w:drawing>
-          <wp:anchor distT="0" distB="0" distL="114300" distR="114300" simplePos="0" relativeHeight="251658240" behindDoc="1" locked="0" layoutInCell="1" allowOverlap="1" wp14:anchorId="5D41F9A3" wp14:editId="310B13A9">
+          <wp:anchor distT="0" distB="0" distL="114300" distR="114300" simplePos="0" relativeHeight="251658240" behindDoc="1" locked="0" layoutInCell="1" allowOverlap="1" wp14:anchorId="5D41F9A3" wp14:editId="7C03683A">
             <wp:simplePos x="0" y="0"/>
             <wp:positionH relativeFrom="column">
-              <wp:posOffset>4678289</wp:posOffset>
+              <wp:posOffset>4678045</wp:posOffset>
             </wp:positionH>
             <wp:positionV relativeFrom="paragraph">
-              <wp:posOffset>10795</wp:posOffset>
+              <wp:posOffset>178435</wp:posOffset>
             </wp:positionV>
-            <wp:extent cx="1080000" cy="1080000"/>
+            <wp:extent cx="1079500" cy="1079500"/>
             <wp:effectExtent l="0" t="0" r="0" b="0"/>
             <wp:wrapNone/>
             <wp:docPr id="966161522" name="Picture 1" descr="A qr code on a white background&#10;&#10;Description automatically generated"/>
@@ -394,7 +350,7 @@
                   <pic:spPr>
                     <a:xfrm>
                       <a:off x="0" y="0"/>
-                      <a:ext cx="1080000" cy="1080000"/>
+                      <a:ext cx="1079500" cy="1079500"/>
                     </a:xfrm>
                     <a:prstGeom prst="rect">
                       <a:avLst/>
@@ -426,6 +382,69 @@
           <w:lang w:val="de-CH"/>
         </w:rPr>
         <w:t>Freundliche Grüsse</w:t>
+      </w:r>
+    </w:p>
+    <w:p>
+      <w:pPr>
+        <w:spacing w:after="120"/>
+        <w:rPr>
+          <w:lang w:val="de-CH"/>
+        </w:rPr>
+      </w:pPr>
+      <w:r>
+        <w:rPr>
+          <w:noProof/>
+          <w:lang w:val="de-CH"/>
+        </w:rPr>
+        <w:drawing>
+          <wp:anchor distT="0" distB="0" distL="114300" distR="114300" simplePos="0" relativeHeight="251659264" behindDoc="1" locked="0" layoutInCell="1" allowOverlap="1" wp14:anchorId="3ED5559C" wp14:editId="3B94DA7A">
+            <wp:simplePos x="0" y="0"/>
+            <wp:positionH relativeFrom="column">
+              <wp:posOffset>2205009</wp:posOffset>
+            </wp:positionH>
+            <wp:positionV relativeFrom="paragraph">
+              <wp:posOffset>129540</wp:posOffset>
+            </wp:positionV>
+            <wp:extent cx="1312753" cy="581112"/>
+            <wp:effectExtent l="0" t="0" r="0" b="3175"/>
+            <wp:wrapNone/>
+            <wp:docPr id="1140917211" name="Picture 1" descr="A close-up of a handwritten text&#10;&#10;Description automatically generated"/>
+            <wp:cNvGraphicFramePr>
+              <a:graphicFrameLocks xmlns:a="http://schemas.openxmlformats.org/drawingml/2006/main" noChangeAspect="1"/>
+            </wp:cNvGraphicFramePr>
+            <a:graphic xmlns:a="http://schemas.openxmlformats.org/drawingml/2006/main">
+              <a:graphicData uri="http://schemas.openxmlformats.org/drawingml/2006/picture">
+                <pic:pic xmlns:pic="http://schemas.openxmlformats.org/drawingml/2006/picture">
+                  <pic:nvPicPr>
+                    <pic:cNvPr id="1140917211" name="Picture 1" descr="A close-up of a handwritten text&#10;&#10;Description automatically generated"/>
+                    <pic:cNvPicPr/>
+                  </pic:nvPicPr>
+                  <pic:blipFill>
+                    <a:blip r:embed="rId7"/>
+                    <a:stretch>
+                      <a:fillRect/>
+                    </a:stretch>
+                  </pic:blipFill>
+                  <pic:spPr>
+                    <a:xfrm>
+                      <a:off x="0" y="0"/>
+                      <a:ext cx="1312753" cy="581112"/>
+                    </a:xfrm>
+                    <a:prstGeom prst="rect">
+                      <a:avLst/>
+                    </a:prstGeom>
+                  </pic:spPr>
+                </pic:pic>
+              </a:graphicData>
+            </a:graphic>
+            <wp14:sizeRelH relativeFrom="page">
+              <wp14:pctWidth>0</wp14:pctWidth>
+            </wp14:sizeRelH>
+            <wp14:sizeRelV relativeFrom="page">
+              <wp14:pctHeight>0</wp14:pctHeight>
+            </wp14:sizeRelV>
+          </wp:anchor>
+        </w:drawing>
       </w:r>
     </w:p>
     <w:p>
@@ -518,10 +537,35 @@
         </w:rPr>
         <w:t>Bewerbungsdossier</w:t>
       </w:r>
+      <w:r>
+        <w:rPr>
+          <w:rFonts w:ascii="Calibri" w:hAnsi="Calibri"/>
+          <w:lang w:val="de-CH"/>
+        </w:rPr>
+        <w:tab/>
+      </w:r>
+      <w:r>
+        <w:rPr>
+          <w:rFonts w:ascii="Calibri" w:hAnsi="Calibri"/>
+          <w:lang w:val="de-CH"/>
+        </w:rPr>
+        <w:tab/>
+      </w:r>
+      <w:r>
+        <w:rPr>
+          <w:rFonts w:ascii="Calibri" w:hAnsi="Calibri"/>
+          <w:i/>
+          <w:iCs/>
+          <w:sz w:val="20"/>
+          <w:szCs w:val="20"/>
+          <w:lang w:val="de-CH"/>
+        </w:rPr>
+        <w:t>Passwort: Beuchat2026</w:t>
+      </w:r>
     </w:p>
     <w:sectPr>
       <w:pgSz w:w="11900" w:h="16840"/>
-      <w:pgMar w:top="1417" w:right="1417" w:bottom="1417" w:left="1417" w:header="720" w:footer="720" w:gutter="0"/>
+      <w:pgMar w:top="1417" w:right="1417" w:bottom="944" w:left="1417" w:header="720" w:footer="720" w:gutter="0"/>
       <w:cols w:space="720"/>
       <w:docGrid w:linePitch="360"/>
     </w:sectPr>

</xml_diff>

<commit_message>
Update cover letter (PDF and Word)
Made-with: Cursor
</commit_message>
<xml_diff>
--- a/0_Cover_Letter_Beuchat.docx
+++ b/0_Cover_Letter_Beuchat.docx
@@ -203,6 +203,10 @@
     </w:p>
     <w:p>
       <w:pPr>
+        <w:tabs>
+          <w:tab w:val="center" w:pos="4536"/>
+          <w:tab w:val="center" w:pos="8222"/>
+        </w:tabs>
         <w:spacing w:after="120"/>
         <w:rPr>
           <w:lang w:val="en-CH"/>
@@ -212,17 +216,15 @@
         <w:rPr>
           <w:lang w:val="en-CH"/>
         </w:rPr>
-        <w:t>W</w:t>
-      </w:r>
-      <w:r>
-        <w:rPr>
-          <w:lang w:val="en-CH"/>
-        </w:rPr>
-        <w:t>ir sind eine fünfköpfige Schweizer Familie und planen aufgrund beruflicher und familiärer Gründe die Rückkehr nach Zürich per Mitte Juli 2026.</w:t>
+        <w:t>Wir sind eine fünfköpfige Schweizer Familie und planen aufgrund beruflicher und familiärer Gründe die Rückkehr nach Zürich ab Mitte Juli 2026.</w:t>
       </w:r>
     </w:p>
     <w:p>
       <w:pPr>
+        <w:tabs>
+          <w:tab w:val="center" w:pos="4536"/>
+          <w:tab w:val="center" w:pos="8222"/>
+        </w:tabs>
         <w:spacing w:after="120"/>
         <w:rPr>
           <w:lang w:val="en-CH"/>
@@ -232,11 +234,15 @@
         <w:rPr>
           <w:lang w:val="en-CH"/>
         </w:rPr>
-        <w:t>Ich bin Managing Director bei UBS im Management Team, und meine Ehefrau, Dr. med. Léa Hochstrasser Beuchat, ist Kinderärztin. Sie hat die Praxis „Kinderärzte Zollikon“ aufgebaut und erfolgreich an Monvia übergeben und verfügt über eine ausgezeichnete Vernetzung und Reputation in der Region Zürich sowie am Kinderspital. Sie freut sich darauf, ihre Tätigkeit in Zürich wieder aufzunehmen.</w:t>
+        <w:t>Ich bin Managing Director bei UBS, meine Ehefrau, Dr. med. Léa Hochstrasser Beuchat, ist Kinderärztin. Sie hat die Praxis „Kinderärzte Zollikon“ aufgebaut und erfolgreich an Monvia übergeben und verfügt über eine ausgezeichnete Vernetzung in der Region Zürich sowie am Kinderspital. Sie freut sich darauf, ihre Tätigkeit in Zürich wieder aufzunehmen.</w:t>
       </w:r>
     </w:p>
     <w:p>
       <w:pPr>
+        <w:tabs>
+          <w:tab w:val="center" w:pos="4536"/>
+          <w:tab w:val="center" w:pos="8222"/>
+        </w:tabs>
         <w:spacing w:after="120"/>
         <w:rPr>
           <w:lang w:val="en-CH"/>
@@ -246,7 +252,130 @@
         <w:rPr>
           <w:lang w:val="en-CH"/>
         </w:rPr>
-        <w:t>Wir haben drei Kinder (12, 7 und 7 Jahre alt) und suchen ein langfristiges Zuhause in Zürich oder in gut angebundenen, familienfreundlichen Wohnlagen</w:t>
+        <w:t>Wir haben drei Kinder (12, 7 und 7 Jahre) und suchen ein langfristiges Zuhause in gut angebundenen, familienfreundlichen Wohnlagen.</w:t>
+      </w:r>
+    </w:p>
+    <w:p>
+      <w:pPr>
+        <w:tabs>
+          <w:tab w:val="center" w:pos="4536"/>
+          <w:tab w:val="center" w:pos="8222"/>
+        </w:tabs>
+        <w:spacing w:after="120"/>
+        <w:rPr>
+          <w:lang w:val="en-CH"/>
+        </w:rPr>
+      </w:pPr>
+      <w:r>
+        <w:rPr>
+          <w:lang w:val="en-CH"/>
+        </w:rPr>
+        <w:t>Das von Ihnen angebotene Objekt spricht uns aufgrund seiner Lage und Qualität besonders an. Wir legen grossen Wert auf ein gepflegtes Zuhause, ein respektvolles Umfeld sowie ein stabiles Mietverhältnis und behandeln die Liegenschaft mit grösster Sorgfalt, als wäre es unser eigenes Zuhause.</w:t>
+      </w:r>
+    </w:p>
+    <w:p>
+      <w:pPr>
+        <w:tabs>
+          <w:tab w:val="center" w:pos="4536"/>
+          <w:tab w:val="center" w:pos="8222"/>
+        </w:tabs>
+        <w:spacing w:after="120"/>
+        <w:rPr>
+          <w:lang w:val="en-CH"/>
+        </w:rPr>
+      </w:pPr>
+      <w:r>
+        <w:rPr>
+          <w:lang w:val="en-CH"/>
+        </w:rPr>
+        <w:t>Wir sind finanziell sehr stabil aufgestellt und stehen für eine zuverlässige und unkomplizierte Zusammenarbeit. Der Einzug ist ab Mitte Juli 2026 flexibel gestaltbar, und wir sind an einer langfristigen Lösung interessiert.</w:t>
+      </w:r>
+    </w:p>
+    <w:p>
+      <w:pPr>
+        <w:tabs>
+          <w:tab w:val="center" w:pos="4536"/>
+          <w:tab w:val="center" w:pos="8222"/>
+        </w:tabs>
+        <w:spacing w:after="120"/>
+        <w:rPr>
+          <w:lang w:val="en-CH"/>
+        </w:rPr>
+      </w:pPr>
+      <w:r>
+        <w:rPr>
+          <w:lang w:val="en-CH"/>
+        </w:rPr>
+        <w:t xml:space="preserve">Vollständiges Bewerbungsdossier Online abrufbar unter: </w:t>
+      </w:r>
+      <w:r>
+        <w:rPr>
+          <w:sz w:val="20"/>
+          <w:szCs w:val="20"/>
+          <w:lang w:val="en-CH"/>
+        </w:rPr>
+        <w:fldChar w:fldCharType="begin"/>
+      </w:r>
+      <w:r>
+        <w:rPr>
+          <w:sz w:val="20"/>
+          <w:szCs w:val="20"/>
+          <w:lang w:val="en-CH"/>
+        </w:rPr>
+        <w:instrText>HYPERLINK "</w:instrText>
+      </w:r>
+      <w:r>
+        <w:rPr>
+          <w:sz w:val="20"/>
+          <w:szCs w:val="20"/>
+          <w:lang w:val="en-CH"/>
+        </w:rPr>
+        <w:instrText>https://github.com/abeuchat-ch/Dossier</w:instrText>
+      </w:r>
+      <w:r>
+        <w:rPr>
+          <w:sz w:val="20"/>
+          <w:szCs w:val="20"/>
+          <w:lang w:val="en-CH"/>
+        </w:rPr>
+        <w:instrText>"</w:instrText>
+      </w:r>
+      <w:r>
+        <w:rPr>
+          <w:sz w:val="20"/>
+          <w:szCs w:val="20"/>
+          <w:lang w:val="en-CH"/>
+        </w:rPr>
+        <w:fldChar w:fldCharType="separate"/>
+      </w:r>
+      <w:r>
+        <w:rPr>
+          <w:rStyle w:val="Hyperlink"/>
+          <w:sz w:val="20"/>
+          <w:szCs w:val="20"/>
+          <w:lang w:val="en-CH"/>
+        </w:rPr>
+        <w:t>https://github.com/abeuchat-ch/Dossier</w:t>
+      </w:r>
+      <w:r>
+        <w:rPr>
+          <w:sz w:val="20"/>
+          <w:szCs w:val="20"/>
+          <w:lang w:val="en-CH"/>
+        </w:rPr>
+        <w:fldChar w:fldCharType="end"/>
+      </w:r>
+      <w:r>
+        <w:rPr>
+          <w:lang w:val="en-CH"/>
+        </w:rPr>
+        <w:t xml:space="preserve">, </w:t>
+      </w:r>
+      <w:r>
+        <w:rPr>
+          <w:lang w:val="en-CH"/>
+        </w:rPr>
+        <w:t>Dokumente sind aus Diskretionsgründen passwortgeschützt</w:t>
       </w:r>
       <w:r>
         <w:rPr>
@@ -257,6 +386,10 @@
     </w:p>
     <w:p>
       <w:pPr>
+        <w:tabs>
+          <w:tab w:val="center" w:pos="4536"/>
+          <w:tab w:val="center" w:pos="8222"/>
+        </w:tabs>
         <w:spacing w:after="120"/>
         <w:rPr>
           <w:lang w:val="en-CH"/>
@@ -266,44 +399,8 @@
         <w:rPr>
           <w:lang w:val="en-CH"/>
         </w:rPr>
-        <w:t>Das von Ihnen angebotene Objekt spricht uns aufgrund seiner Lage, Qualität und Eignung für eine Familie besonders an. Wir legen grossen Wert auf ein gepflegtes Zuhause, ein ruhiges und respektvolles nachbarschaftliches Umfeld sowie ein stabiles Mietverhältnis. Selbstverständlich behandeln wir die Liegenschaft mit grosser Sorgfalt, als wäre es unser eigenes Zuhause.</w:t>
+        <w:t>Nach der Besichtigung sind wir überzeugt, dass die Liegenschaft optimal zu unseren Bedürfnissen als Familie passt. Gerne würden wir das Mietverhältnis eingehen und stehen für die nächsten Schritte jederzeit zur Verfügung.</w:t>
       </w:r>
-    </w:p>
-    <w:p>
-      <w:pPr>
-        <w:spacing w:after="120"/>
-        <w:rPr>
-          <w:lang w:val="en-CH"/>
-        </w:rPr>
-      </w:pPr>
-      <w:r>
-        <w:rPr>
-          <w:lang w:val="en-CH"/>
-        </w:rPr>
-        <w:t>Wir sind finanziell sehr stabil aufgestellt und stehen für eine jederzeit zuverlässige und unkomplizierte Zusammenarbeit. Einzugstermin ist flexibel gestaltbar, und wir sind an einer langfristigen Lösung interessiert.</w:t>
-      </w:r>
-    </w:p>
-    <w:p>
-      <w:pPr>
-        <w:rPr>
-          <w:lang w:val="de-CH"/>
-        </w:rPr>
-      </w:pPr>
-      <w:r>
-        <w:rPr>
-          <w:lang w:val="en-CH"/>
-        </w:rPr>
-        <w:t>Wir freuen uns sehr über die Möglichkeit einer Besichtigung und stehen für weitere Informationen jederzeit gerne zur Verfügung.</w:t>
-      </w:r>
-    </w:p>
-    <w:p>
-      <w:pPr>
-        <w:spacing w:after="120"/>
-        <w:rPr>
-          <w:rFonts w:ascii="Calibri" w:hAnsi="Calibri"/>
-          <w:lang w:val="de-CH"/>
-        </w:rPr>
-      </w:pPr>
     </w:p>
     <w:p>
       <w:pPr>
@@ -471,6 +568,11 @@
         </w:tabs>
         <w:spacing w:after="120"/>
         <w:rPr>
+          <w:rFonts w:ascii="Calibri" w:hAnsi="Calibri"/>
+          <w:i/>
+          <w:iCs/>
+          <w:sz w:val="20"/>
+          <w:szCs w:val="20"/>
           <w:lang w:val="de-CH"/>
         </w:rPr>
       </w:pPr>
@@ -12155,6 +12257,29 @@
       </w:tcPr>
     </w:tblStylePr>
   </w:style>
+  <w:style w:type="character" w:styleId="Hyperlink">
+    <w:name w:val="Hyperlink"/>
+    <w:basedOn w:val="DefaultParagraphFont"/>
+    <w:uiPriority w:val="99"/>
+    <w:unhideWhenUsed/>
+    <w:rsid w:val="00E7231E"/>
+    <w:rPr>
+      <w:color w:val="0000FF" w:themeColor="hyperlink"/>
+      <w:u w:val="single"/>
+    </w:rPr>
+  </w:style>
+  <w:style w:type="character" w:styleId="UnresolvedMention">
+    <w:name w:val="Unresolved Mention"/>
+    <w:basedOn w:val="DefaultParagraphFont"/>
+    <w:uiPriority w:val="99"/>
+    <w:semiHidden/>
+    <w:unhideWhenUsed/>
+    <w:rsid w:val="00E7231E"/>
+    <w:rPr>
+      <w:color w:val="605E5C"/>
+      <w:shd w:val="clear" w:color="auto" w:fill="E1DFDD"/>
+    </w:rPr>
+  </w:style>
 </w:styles>
 </file>
 

</xml_diff>

<commit_message>
Update cover letter Word document
Made-with: Cursor
</commit_message>
<xml_diff>
--- a/0_Cover_Letter_Beuchat.docx
+++ b/0_Cover_Letter_Beuchat.docx
@@ -7,6 +7,8 @@
         <w:spacing w:after="120"/>
         <w:ind w:right="50"/>
         <w:rPr>
+          <w:sz w:val="21"/>
+          <w:szCs w:val="21"/>
           <w:lang w:val="de-CH"/>
         </w:rPr>
       </w:pPr>
@@ -14,6 +16,8 @@
         <w:rPr>
           <w:rFonts w:ascii="Calibri" w:hAnsi="Calibri"/>
           <w:b/>
+          <w:sz w:val="21"/>
+          <w:szCs w:val="21"/>
           <w:lang w:val="de-CH"/>
         </w:rPr>
         <w:t xml:space="preserve">Antoine </w:t>
@@ -23,6 +27,8 @@
         <w:rPr>
           <w:rFonts w:ascii="Calibri" w:hAnsi="Calibri"/>
           <w:b/>
+          <w:sz w:val="21"/>
+          <w:szCs w:val="21"/>
           <w:lang w:val="de-CH"/>
         </w:rPr>
         <w:t>Beuchat</w:t>
@@ -32,6 +38,8 @@
         <w:rPr>
           <w:rFonts w:ascii="Calibri" w:hAnsi="Calibri"/>
           <w:b/>
+          <w:sz w:val="21"/>
+          <w:szCs w:val="21"/>
           <w:lang w:val="de-CH"/>
         </w:rPr>
         <w:t xml:space="preserve"> &amp; Dr. med. Léa Hochstrasser </w:t>
@@ -41,6 +49,8 @@
         <w:rPr>
           <w:rFonts w:ascii="Calibri" w:hAnsi="Calibri"/>
           <w:b/>
+          <w:sz w:val="21"/>
+          <w:szCs w:val="21"/>
           <w:lang w:val="de-CH"/>
         </w:rPr>
         <w:t>Beuchat</w:t>
@@ -51,12 +61,16 @@
       <w:pPr>
         <w:spacing w:after="120"/>
         <w:rPr>
+          <w:sz w:val="21"/>
+          <w:szCs w:val="21"/>
           <w:lang w:val="fr-CH"/>
         </w:rPr>
       </w:pPr>
       <w:r>
         <w:rPr>
           <w:rFonts w:ascii="Calibri" w:hAnsi="Calibri"/>
+          <w:sz w:val="21"/>
+          <w:szCs w:val="21"/>
           <w:lang w:val="fr-CH"/>
         </w:rPr>
         <w:t xml:space="preserve">Route de la </w:t>
@@ -65,6 +79,8 @@
       <w:r>
         <w:rPr>
           <w:rFonts w:ascii="Calibri" w:hAnsi="Calibri"/>
+          <w:sz w:val="21"/>
+          <w:szCs w:val="21"/>
           <w:lang w:val="fr-CH"/>
         </w:rPr>
         <w:t>Crottaz</w:t>
@@ -73,12 +89,16 @@
       <w:r>
         <w:rPr>
           <w:rFonts w:ascii="Calibri" w:hAnsi="Calibri"/>
+          <w:sz w:val="21"/>
+          <w:szCs w:val="21"/>
           <w:lang w:val="fr-CH"/>
         </w:rPr>
         <w:t xml:space="preserve"> 54D</w:t>
       </w:r>
       <w:r>
         <w:rPr>
+          <w:sz w:val="21"/>
+          <w:szCs w:val="21"/>
           <w:lang w:val="fr-CH"/>
         </w:rPr>
         <w:t xml:space="preserve">, </w:t>
@@ -86,6 +106,8 @@
       <w:r>
         <w:rPr>
           <w:rFonts w:ascii="Calibri" w:hAnsi="Calibri"/>
+          <w:sz w:val="21"/>
+          <w:szCs w:val="21"/>
           <w:lang w:val="fr-CH"/>
         </w:rPr>
         <w:t xml:space="preserve">1802 </w:t>
@@ -94,6 +116,8 @@
       <w:r>
         <w:rPr>
           <w:rFonts w:ascii="Calibri" w:hAnsi="Calibri"/>
+          <w:sz w:val="21"/>
+          <w:szCs w:val="21"/>
           <w:lang w:val="fr-CH"/>
         </w:rPr>
         <w:t>Corseaux</w:t>
@@ -104,12 +128,16 @@
       <w:pPr>
         <w:spacing w:after="120"/>
         <w:rPr>
+          <w:sz w:val="21"/>
+          <w:szCs w:val="21"/>
           <w:lang w:val="de-CH"/>
         </w:rPr>
       </w:pPr>
       <w:r>
         <w:rPr>
           <w:rFonts w:ascii="Calibri" w:hAnsi="Calibri"/>
+          <w:sz w:val="21"/>
+          <w:szCs w:val="21"/>
           <w:lang w:val="de-CH"/>
         </w:rPr>
         <w:t>+41 78 913 22 44</w:t>
@@ -117,6 +145,8 @@
       <w:r>
         <w:rPr>
           <w:rFonts w:ascii="Calibri" w:hAnsi="Calibri"/>
+          <w:sz w:val="21"/>
+          <w:szCs w:val="21"/>
           <w:lang w:val="de-CH"/>
         </w:rPr>
         <w:t xml:space="preserve">, </w:t>
@@ -124,6 +154,8 @@
       <w:r>
         <w:rPr>
           <w:rFonts w:ascii="Calibri" w:hAnsi="Calibri"/>
+          <w:sz w:val="21"/>
+          <w:szCs w:val="21"/>
           <w:lang w:val="de-CH"/>
         </w:rPr>
         <w:t>abeuchat@gmail.com</w:t>
@@ -132,6 +164,8 @@
     <w:p>
       <w:pPr>
         <w:rPr>
+          <w:sz w:val="21"/>
+          <w:szCs w:val="21"/>
           <w:lang w:val="de-CH"/>
         </w:rPr>
       </w:pPr>
@@ -139,6 +173,17 @@
     <w:p>
       <w:pPr>
         <w:rPr>
+          <w:sz w:val="21"/>
+          <w:szCs w:val="21"/>
+          <w:lang w:val="de-CH"/>
+        </w:rPr>
+      </w:pPr>
+    </w:p>
+    <w:p>
+      <w:pPr>
+        <w:rPr>
+          <w:sz w:val="21"/>
+          <w:szCs w:val="21"/>
           <w:lang w:val="de-CH"/>
         </w:rPr>
       </w:pPr>
@@ -148,14 +193,16 @@
         <w:spacing w:after="120"/>
         <w:rPr>
           <w:b/>
-          <w:sz w:val="28"/>
+          <w:sz w:val="24"/>
+          <w:szCs w:val="21"/>
           <w:lang w:val="de-CH"/>
         </w:rPr>
       </w:pPr>
       <w:r>
         <w:rPr>
           <w:b/>
-          <w:sz w:val="28"/>
+          <w:sz w:val="24"/>
+          <w:szCs w:val="21"/>
           <w:lang w:val="de-CH"/>
         </w:rPr>
         <w:t>Bewerbung für ein Einfamilienhaus / eine Familienwohnung in Zürich und Umgebung</w:t>
@@ -166,6 +213,8 @@
         <w:spacing w:after="120"/>
         <w:rPr>
           <w:rFonts w:ascii="Calibri" w:hAnsi="Calibri"/>
+          <w:sz w:val="21"/>
+          <w:szCs w:val="21"/>
           <w:lang w:val="de-CH"/>
         </w:rPr>
       </w:pPr>
@@ -175,6 +224,8 @@
         <w:spacing w:after="120"/>
         <w:rPr>
           <w:rFonts w:ascii="Calibri" w:hAnsi="Calibri"/>
+          <w:sz w:val="21"/>
+          <w:szCs w:val="21"/>
           <w:lang w:val="de-CH"/>
         </w:rPr>
       </w:pPr>
@@ -183,11 +234,15 @@
       <w:pPr>
         <w:spacing w:after="120"/>
         <w:rPr>
+          <w:sz w:val="21"/>
+          <w:szCs w:val="21"/>
           <w:lang w:val="en-CH"/>
         </w:rPr>
       </w:pPr>
       <w:r>
         <w:rPr>
+          <w:sz w:val="21"/>
+          <w:szCs w:val="21"/>
           <w:lang w:val="en-CH"/>
         </w:rPr>
         <w:t>Sehr geehrte Damen und Herren,</w:t>
@@ -197,6 +252,8 @@
       <w:pPr>
         <w:spacing w:after="120"/>
         <w:rPr>
+          <w:sz w:val="21"/>
+          <w:szCs w:val="21"/>
           <w:lang w:val="en-CH"/>
         </w:rPr>
       </w:pPr>
@@ -209,11 +266,15 @@
         </w:tabs>
         <w:spacing w:after="120"/>
         <w:rPr>
+          <w:sz w:val="21"/>
+          <w:szCs w:val="21"/>
           <w:lang w:val="en-CH"/>
         </w:rPr>
       </w:pPr>
       <w:r>
         <w:rPr>
+          <w:sz w:val="21"/>
+          <w:szCs w:val="21"/>
           <w:lang w:val="en-CH"/>
         </w:rPr>
         <w:t>Wir sind eine fünfköpfige Schweizer Familie und planen aufgrund beruflicher und familiärer Gründe die Rückkehr nach Zürich ab Mitte Juli 2026.</w:t>
@@ -227,11 +288,15 @@
         </w:tabs>
         <w:spacing w:after="120"/>
         <w:rPr>
+          <w:sz w:val="21"/>
+          <w:szCs w:val="21"/>
           <w:lang w:val="en-CH"/>
         </w:rPr>
       </w:pPr>
       <w:r>
         <w:rPr>
+          <w:sz w:val="21"/>
+          <w:szCs w:val="21"/>
           <w:lang w:val="en-CH"/>
         </w:rPr>
         <w:t>Ich bin Managing Director bei UBS, meine Ehefrau, Dr. med. Léa Hochstrasser Beuchat, ist Kinderärztin. Sie hat die Praxis „Kinderärzte Zollikon“ aufgebaut und erfolgreich an Monvia übergeben und verfügt über eine ausgezeichnete Vernetzung in der Region Zürich sowie am Kinderspital. Sie freut sich darauf, ihre Tätigkeit in Zürich wieder aufzunehmen.</w:t>
@@ -245,11 +310,15 @@
         </w:tabs>
         <w:spacing w:after="120"/>
         <w:rPr>
+          <w:sz w:val="21"/>
+          <w:szCs w:val="21"/>
           <w:lang w:val="en-CH"/>
         </w:rPr>
       </w:pPr>
       <w:r>
         <w:rPr>
+          <w:sz w:val="21"/>
+          <w:szCs w:val="21"/>
           <w:lang w:val="en-CH"/>
         </w:rPr>
         <w:t>Wir haben drei Kinder (12, 7 und 7 Jahre) und suchen ein langfristiges Zuhause in gut angebundenen, familienfreundlichen Wohnlagen.</w:t>
@@ -263,11 +332,15 @@
         </w:tabs>
         <w:spacing w:after="120"/>
         <w:rPr>
+          <w:sz w:val="21"/>
+          <w:szCs w:val="21"/>
           <w:lang w:val="en-CH"/>
         </w:rPr>
       </w:pPr>
       <w:r>
         <w:rPr>
+          <w:sz w:val="21"/>
+          <w:szCs w:val="21"/>
           <w:lang w:val="en-CH"/>
         </w:rPr>
         <w:t>Das von Ihnen angebotene Objekt spricht uns aufgrund seiner Lage und Qualität besonders an. Wir legen grossen Wert auf ein gepflegtes Zuhause, ein respektvolles Umfeld sowie ein stabiles Mietverhältnis und behandeln die Liegenschaft mit grösster Sorgfalt, als wäre es unser eigenes Zuhause.</w:t>
@@ -281,11 +354,15 @@
         </w:tabs>
         <w:spacing w:after="120"/>
         <w:rPr>
+          <w:sz w:val="21"/>
+          <w:szCs w:val="21"/>
           <w:lang w:val="en-CH"/>
         </w:rPr>
       </w:pPr>
       <w:r>
         <w:rPr>
+          <w:sz w:val="21"/>
+          <w:szCs w:val="21"/>
           <w:lang w:val="en-CH"/>
         </w:rPr>
         <w:t>Wir sind finanziell sehr stabil aufgestellt und stehen für eine zuverlässige und unkomplizierte Zusammenarbeit. Der Einzug ist ab Mitte Juli 2026 flexibel gestaltbar, und wir sind an einer langfristigen Lösung interessiert.</w:t>
@@ -299,51 +376,55 @@
         </w:tabs>
         <w:spacing w:after="120"/>
         <w:rPr>
+          <w:sz w:val="21"/>
+          <w:szCs w:val="21"/>
           <w:lang w:val="en-CH"/>
         </w:rPr>
       </w:pPr>
       <w:r>
         <w:rPr>
+          <w:sz w:val="21"/>
+          <w:szCs w:val="21"/>
           <w:lang w:val="en-CH"/>
         </w:rPr>
         <w:t xml:space="preserve">Vollständiges Bewerbungsdossier Online abrufbar unter: </w:t>
       </w:r>
       <w:r>
         <w:rPr>
-          <w:sz w:val="20"/>
-          <w:szCs w:val="20"/>
+          <w:sz w:val="18"/>
+          <w:szCs w:val="18"/>
           <w:lang w:val="en-CH"/>
         </w:rPr>
         <w:fldChar w:fldCharType="begin"/>
       </w:r>
       <w:r>
         <w:rPr>
-          <w:sz w:val="20"/>
-          <w:szCs w:val="20"/>
+          <w:sz w:val="18"/>
+          <w:szCs w:val="18"/>
           <w:lang w:val="en-CH"/>
         </w:rPr>
         <w:instrText>HYPERLINK "</w:instrText>
       </w:r>
       <w:r>
         <w:rPr>
-          <w:sz w:val="20"/>
-          <w:szCs w:val="20"/>
+          <w:sz w:val="18"/>
+          <w:szCs w:val="18"/>
           <w:lang w:val="en-CH"/>
         </w:rPr>
         <w:instrText>https://github.com/abeuchat-ch/Dossier</w:instrText>
       </w:r>
       <w:r>
         <w:rPr>
-          <w:sz w:val="20"/>
-          <w:szCs w:val="20"/>
+          <w:sz w:val="18"/>
+          <w:szCs w:val="18"/>
           <w:lang w:val="en-CH"/>
         </w:rPr>
         <w:instrText>"</w:instrText>
       </w:r>
       <w:r>
         <w:rPr>
-          <w:sz w:val="20"/>
-          <w:szCs w:val="20"/>
+          <w:sz w:val="18"/>
+          <w:szCs w:val="18"/>
           <w:lang w:val="en-CH"/>
         </w:rPr>
         <w:fldChar w:fldCharType="separate"/>
@@ -351,34 +432,40 @@
       <w:r>
         <w:rPr>
           <w:rStyle w:val="Hyperlink"/>
-          <w:sz w:val="20"/>
-          <w:szCs w:val="20"/>
+          <w:sz w:val="18"/>
+          <w:szCs w:val="18"/>
           <w:lang w:val="en-CH"/>
         </w:rPr>
         <w:t>https://github.com/abeuchat-ch/Dossier</w:t>
       </w:r>
       <w:r>
         <w:rPr>
-          <w:sz w:val="20"/>
-          <w:szCs w:val="20"/>
+          <w:sz w:val="18"/>
+          <w:szCs w:val="18"/>
           <w:lang w:val="en-CH"/>
         </w:rPr>
         <w:fldChar w:fldCharType="end"/>
       </w:r>
       <w:r>
         <w:rPr>
+          <w:sz w:val="21"/>
+          <w:szCs w:val="21"/>
           <w:lang w:val="en-CH"/>
         </w:rPr>
         <w:t xml:space="preserve">, </w:t>
       </w:r>
       <w:r>
         <w:rPr>
+          <w:sz w:val="21"/>
+          <w:szCs w:val="21"/>
           <w:lang w:val="en-CH"/>
         </w:rPr>
         <w:t>Dokumente sind aus Diskretionsgründen passwortgeschützt</w:t>
       </w:r>
       <w:r>
         <w:rPr>
+          <w:sz w:val="21"/>
+          <w:szCs w:val="21"/>
           <w:lang w:val="en-CH"/>
         </w:rPr>
         <w:t>.</w:t>
@@ -392,11 +479,15 @@
         </w:tabs>
         <w:spacing w:after="120"/>
         <w:rPr>
+          <w:sz w:val="21"/>
+          <w:szCs w:val="21"/>
           <w:lang w:val="en-CH"/>
         </w:rPr>
       </w:pPr>
       <w:r>
         <w:rPr>
+          <w:sz w:val="21"/>
+          <w:szCs w:val="21"/>
           <w:lang w:val="en-CH"/>
         </w:rPr>
         <w:t>Nach der Besichtigung sind wir überzeugt, dass die Liegenschaft optimal zu unseren Bedürfnissen als Familie passt. Gerne würden wir das Mietverhältnis eingehen und stehen für die nächsten Schritte jederzeit zur Verfügung.</w:t>
@@ -407,27 +498,146 @@
         <w:spacing w:after="120"/>
         <w:rPr>
           <w:rFonts w:ascii="Calibri" w:hAnsi="Calibri"/>
+          <w:sz w:val="21"/>
+          <w:szCs w:val="21"/>
+          <w:lang w:val="de-CH"/>
+        </w:rPr>
+      </w:pPr>
+    </w:p>
+    <w:p>
+      <w:pPr>
+        <w:spacing w:after="120"/>
+        <w:rPr>
+          <w:rFonts w:ascii="Calibri" w:hAnsi="Calibri"/>
+          <w:sz w:val="21"/>
+          <w:szCs w:val="21"/>
+          <w:lang w:val="de-CH"/>
+        </w:rPr>
+      </w:pPr>
+      <w:r>
+        <w:rPr>
+          <w:rFonts w:ascii="Calibri" w:hAnsi="Calibri"/>
+          <w:sz w:val="21"/>
+          <w:szCs w:val="21"/>
+          <w:lang w:val="de-CH"/>
+        </w:rPr>
+        <w:t>Freundliche Grüsse</w:t>
+      </w:r>
+    </w:p>
+    <w:p>
+      <w:pPr>
+        <w:spacing w:after="120"/>
+        <w:rPr>
+          <w:sz w:val="21"/>
+          <w:szCs w:val="21"/>
           <w:lang w:val="de-CH"/>
         </w:rPr>
       </w:pPr>
       <w:r>
         <w:rPr>
           <w:noProof/>
+          <w:sz w:val="21"/>
+          <w:szCs w:val="21"/>
+          <w:lang w:val="de-CH"/>
+        </w:rPr>
+        <mc:AlternateContent>
+          <mc:Choice Requires="wps">
+            <w:drawing>
+              <wp:anchor distT="0" distB="0" distL="114300" distR="114300" simplePos="0" relativeHeight="251657215" behindDoc="1" locked="0" layoutInCell="1" allowOverlap="1" wp14:anchorId="67A94772" wp14:editId="2CEC3D36">
+                <wp:simplePos x="0" y="0"/>
+                <wp:positionH relativeFrom="column">
+                  <wp:posOffset>5168900</wp:posOffset>
+                </wp:positionH>
+                <wp:positionV relativeFrom="paragraph">
+                  <wp:posOffset>157676</wp:posOffset>
+                </wp:positionV>
+                <wp:extent cx="1445467" cy="1745438"/>
+                <wp:effectExtent l="50800" t="25400" r="53340" b="58420"/>
+                <wp:wrapNone/>
+                <wp:docPr id="774174482" name="Rectangle 3"/>
+                <wp:cNvGraphicFramePr/>
+                <a:graphic xmlns:a="http://schemas.openxmlformats.org/drawingml/2006/main">
+                  <a:graphicData uri="http://schemas.microsoft.com/office/word/2010/wordprocessingShape">
+                    <wps:wsp>
+                      <wps:cNvSpPr/>
+                      <wps:spPr>
+                        <a:xfrm>
+                          <a:off x="0" y="0"/>
+                          <a:ext cx="1445467" cy="1745438"/>
+                        </a:xfrm>
+                        <a:prstGeom prst="rect">
+                          <a:avLst/>
+                        </a:prstGeom>
+                        <a:solidFill>
+                          <a:schemeClr val="bg1">
+                            <a:lumMod val="85000"/>
+                          </a:schemeClr>
+                        </a:solidFill>
+                        <a:ln>
+                          <a:noFill/>
+                        </a:ln>
+                      </wps:spPr>
+                      <wps:style>
+                        <a:lnRef idx="1">
+                          <a:schemeClr val="accent1"/>
+                        </a:lnRef>
+                        <a:fillRef idx="3">
+                          <a:schemeClr val="accent1"/>
+                        </a:fillRef>
+                        <a:effectRef idx="2">
+                          <a:schemeClr val="accent1"/>
+                        </a:effectRef>
+                        <a:fontRef idx="minor">
+                          <a:schemeClr val="lt1"/>
+                        </a:fontRef>
+                      </wps:style>
+                      <wps:bodyPr rot="0" spcFirstLastPara="0" vertOverflow="overflow" horzOverflow="overflow" vert="horz" wrap="square" lIns="91440" tIns="45720" rIns="91440" bIns="45720" numCol="1" spcCol="0" rtlCol="0" fromWordArt="0" anchor="ctr" anchorCtr="0" forceAA="0" compatLnSpc="1">
+                        <a:prstTxWarp prst="textNoShape">
+                          <a:avLst/>
+                        </a:prstTxWarp>
+                        <a:noAutofit/>
+                      </wps:bodyPr>
+                    </wps:wsp>
+                  </a:graphicData>
+                </a:graphic>
+                <wp14:sizeRelH relativeFrom="margin">
+                  <wp14:pctWidth>0</wp14:pctWidth>
+                </wp14:sizeRelH>
+                <wp14:sizeRelV relativeFrom="margin">
+                  <wp14:pctHeight>0</wp14:pctHeight>
+                </wp14:sizeRelV>
+              </wp:anchor>
+            </w:drawing>
+          </mc:Choice>
+          <mc:Fallback>
+            <w:pict>
+              <v:rect w14:anchorId="3A475115" id="Rectangle 3" o:spid="_x0000_s1026" style="position:absolute;margin-left:407pt;margin-top:12.4pt;width:113.8pt;height:137.45pt;z-index:-251659265;visibility:visible;mso-wrap-style:square;mso-width-percent:0;mso-height-percent:0;mso-wrap-distance-left:9pt;mso-wrap-distance-top:0;mso-wrap-distance-right:9pt;mso-wrap-distance-bottom:0;mso-position-horizontal:absolute;mso-position-horizontal-relative:text;mso-position-vertical:absolute;mso-position-vertical-relative:text;mso-width-percent:0;mso-height-percent:0;mso-width-relative:margin;mso-height-relative:margin;v-text-anchor:middle" o:gfxdata="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" fillcolor="#d8d8d8 [2732]" stroked="f">
+                <v:shadow on="t" color="black" opacity="22937f" origin=",.5" offset="0,.63889mm"/>
+              </v:rect>
+            </w:pict>
+          </mc:Fallback>
+        </mc:AlternateContent>
+      </w:r>
+      <w:r>
+        <w:rPr>
+          <w:noProof/>
+          <w:sz w:val="21"/>
+          <w:szCs w:val="21"/>
           <w:lang w:val="de-CH"/>
         </w:rPr>
         <w:drawing>
-          <wp:anchor distT="0" distB="0" distL="114300" distR="114300" simplePos="0" relativeHeight="251658240" behindDoc="1" locked="0" layoutInCell="1" allowOverlap="1" wp14:anchorId="5D41F9A3" wp14:editId="7C03683A">
+          <wp:anchor distT="0" distB="0" distL="114300" distR="114300" simplePos="0" relativeHeight="251660288" behindDoc="1" locked="0" layoutInCell="1" allowOverlap="1" wp14:anchorId="3BD440DA" wp14:editId="6E0A8FF8">
             <wp:simplePos x="0" y="0"/>
             <wp:positionH relativeFrom="column">
-              <wp:posOffset>4678045</wp:posOffset>
+              <wp:posOffset>-158290</wp:posOffset>
             </wp:positionH>
             <wp:positionV relativeFrom="paragraph">
-              <wp:posOffset>178435</wp:posOffset>
+              <wp:posOffset>221856</wp:posOffset>
             </wp:positionV>
-            <wp:extent cx="1079500" cy="1079500"/>
-            <wp:effectExtent l="0" t="0" r="0" b="0"/>
+            <wp:extent cx="1469087" cy="494315"/>
+            <wp:effectExtent l="0" t="0" r="4445" b="1270"/>
             <wp:wrapNone/>
-            <wp:docPr id="966161522" name="Picture 1" descr="A qr code on a white background&#10;&#10;Description automatically generated"/>
+            <wp:docPr id="114007650" name="Picture 1" descr="A close-up of a signature&#10;&#10;Description automatically generated"/>
             <wp:cNvGraphicFramePr>
               <a:graphicFrameLocks xmlns:a="http://schemas.openxmlformats.org/drawingml/2006/main" noChangeAspect="1"/>
             </wp:cNvGraphicFramePr>
@@ -435,7 +645,7 @@
               <a:graphicData uri="http://schemas.openxmlformats.org/drawingml/2006/picture">
                 <pic:pic xmlns:pic="http://schemas.openxmlformats.org/drawingml/2006/picture">
                   <pic:nvPicPr>
-                    <pic:cNvPr id="966161522" name="Picture 1" descr="A qr code on a white background&#10;&#10;Description automatically generated"/>
+                    <pic:cNvPr id="114007650" name="Picture 1" descr="A close-up of a signature&#10;&#10;Description automatically generated"/>
                     <pic:cNvPicPr/>
                   </pic:nvPicPr>
                   <pic:blipFill>
@@ -447,7 +657,7 @@
                   <pic:spPr>
                     <a:xfrm>
                       <a:off x="0" y="0"/>
-                      <a:ext cx="1079500" cy="1079500"/>
+                      <a:ext cx="1469087" cy="494315"/>
                     </a:xfrm>
                     <a:prstGeom prst="rect">
                       <a:avLst/>
@@ -456,45 +666,24 @@
                 </pic:pic>
               </a:graphicData>
             </a:graphic>
-            <wp14:sizeRelH relativeFrom="margin">
+            <wp14:sizeRelH relativeFrom="page">
               <wp14:pctWidth>0</wp14:pctWidth>
             </wp14:sizeRelH>
-            <wp14:sizeRelV relativeFrom="margin">
+            <wp14:sizeRelV relativeFrom="page">
               <wp14:pctHeight>0</wp14:pctHeight>
             </wp14:sizeRelV>
           </wp:anchor>
         </w:drawing>
       </w:r>
-    </w:p>
-    <w:p>
-      <w:pPr>
-        <w:spacing w:after="120"/>
-        <w:rPr>
-          <w:lang w:val="de-CH"/>
-        </w:rPr>
-      </w:pPr>
-      <w:r>
-        <w:rPr>
-          <w:rFonts w:ascii="Calibri" w:hAnsi="Calibri"/>
-          <w:lang w:val="de-CH"/>
-        </w:rPr>
-        <w:t>Freundliche Grüsse</w:t>
-      </w:r>
-    </w:p>
-    <w:p>
-      <w:pPr>
-        <w:spacing w:after="120"/>
-        <w:rPr>
-          <w:lang w:val="de-CH"/>
-        </w:rPr>
-      </w:pPr>
       <w:r>
         <w:rPr>
           <w:noProof/>
+          <w:sz w:val="21"/>
+          <w:szCs w:val="21"/>
           <w:lang w:val="de-CH"/>
         </w:rPr>
         <w:drawing>
-          <wp:anchor distT="0" distB="0" distL="114300" distR="114300" simplePos="0" relativeHeight="251659264" behindDoc="1" locked="0" layoutInCell="1" allowOverlap="1" wp14:anchorId="3ED5559C" wp14:editId="3B94DA7A">
+          <wp:anchor distT="0" distB="0" distL="114300" distR="114300" simplePos="0" relativeHeight="251659264" behindDoc="1" locked="0" layoutInCell="1" allowOverlap="1" wp14:anchorId="3ED5559C" wp14:editId="26421368">
             <wp:simplePos x="0" y="0"/>
             <wp:positionH relativeFrom="column">
               <wp:posOffset>2205009</wp:posOffset>
@@ -548,14 +737,75 @@
       <w:pPr>
         <w:spacing w:after="120"/>
         <w:rPr>
+          <w:sz w:val="21"/>
+          <w:szCs w:val="21"/>
           <w:lang w:val="de-CH"/>
         </w:rPr>
       </w:pPr>
+      <w:r>
+        <w:rPr>
+          <w:noProof/>
+          <w:sz w:val="21"/>
+          <w:szCs w:val="21"/>
+          <w:lang w:val="de-CH"/>
+        </w:rPr>
+        <w:drawing>
+          <wp:anchor distT="0" distB="0" distL="114300" distR="114300" simplePos="0" relativeHeight="251658240" behindDoc="1" locked="0" layoutInCell="1" allowOverlap="1" wp14:anchorId="5D41F9A3" wp14:editId="3DA33C15">
+            <wp:simplePos x="0" y="0"/>
+            <wp:positionH relativeFrom="column">
+              <wp:posOffset>5344160</wp:posOffset>
+            </wp:positionH>
+            <wp:positionV relativeFrom="paragraph">
+              <wp:posOffset>76200</wp:posOffset>
+            </wp:positionV>
+            <wp:extent cx="1079500" cy="1079500"/>
+            <wp:effectExtent l="0" t="0" r="0" b="0"/>
+            <wp:wrapNone/>
+            <wp:docPr id="966161522" name="Picture 1" descr="A qr code on a white background&#10;&#10;Description automatically generated"/>
+            <wp:cNvGraphicFramePr>
+              <a:graphicFrameLocks xmlns:a="http://schemas.openxmlformats.org/drawingml/2006/main" noChangeAspect="1"/>
+            </wp:cNvGraphicFramePr>
+            <a:graphic xmlns:a="http://schemas.openxmlformats.org/drawingml/2006/main">
+              <a:graphicData uri="http://schemas.openxmlformats.org/drawingml/2006/picture">
+                <pic:pic xmlns:pic="http://schemas.openxmlformats.org/drawingml/2006/picture">
+                  <pic:nvPicPr>
+                    <pic:cNvPr id="966161522" name="Picture 1" descr="A qr code on a white background&#10;&#10;Description automatically generated"/>
+                    <pic:cNvPicPr/>
+                  </pic:nvPicPr>
+                  <pic:blipFill>
+                    <a:blip r:embed="rId8"/>
+                    <a:stretch>
+                      <a:fillRect/>
+                    </a:stretch>
+                  </pic:blipFill>
+                  <pic:spPr>
+                    <a:xfrm>
+                      <a:off x="0" y="0"/>
+                      <a:ext cx="1079500" cy="1079500"/>
+                    </a:xfrm>
+                    <a:prstGeom prst="rect">
+                      <a:avLst/>
+                    </a:prstGeom>
+                  </pic:spPr>
+                </pic:pic>
+              </a:graphicData>
+            </a:graphic>
+            <wp14:sizeRelH relativeFrom="margin">
+              <wp14:pctWidth>0</wp14:pctWidth>
+            </wp14:sizeRelH>
+            <wp14:sizeRelV relativeFrom="margin">
+              <wp14:pctHeight>0</wp14:pctHeight>
+            </wp14:sizeRelV>
+          </wp:anchor>
+        </w:drawing>
+      </w:r>
     </w:p>
     <w:p>
       <w:pPr>
         <w:spacing w:after="120"/>
         <w:rPr>
+          <w:sz w:val="21"/>
+          <w:szCs w:val="21"/>
           <w:lang w:val="de-CH"/>
         </w:rPr>
       </w:pPr>
@@ -571,14 +821,164 @@
           <w:rFonts w:ascii="Calibri" w:hAnsi="Calibri"/>
           <w:i/>
           <w:iCs/>
-          <w:sz w:val="20"/>
-          <w:szCs w:val="20"/>
+          <w:sz w:val="18"/>
+          <w:szCs w:val="18"/>
           <w:lang w:val="de-CH"/>
         </w:rPr>
       </w:pPr>
       <w:r>
         <w:rPr>
+          <w:noProof/>
+          <w:sz w:val="21"/>
+          <w:szCs w:val="21"/>
+          <w:lang w:val="de-CH"/>
+        </w:rPr>
+        <mc:AlternateContent>
+          <mc:Choice Requires="wps">
+            <w:drawing>
+              <wp:anchor distT="0" distB="0" distL="114300" distR="114300" simplePos="0" relativeHeight="251661312" behindDoc="0" locked="0" layoutInCell="1" allowOverlap="1" wp14:anchorId="007B611C" wp14:editId="2E0433AB">
+                <wp:simplePos x="0" y="0"/>
+                <wp:positionH relativeFrom="column">
+                  <wp:posOffset>5264785</wp:posOffset>
+                </wp:positionH>
+                <wp:positionV relativeFrom="paragraph">
+                  <wp:posOffset>663363</wp:posOffset>
+                </wp:positionV>
+                <wp:extent cx="1347293" cy="451485"/>
+                <wp:effectExtent l="0" t="0" r="0" b="0"/>
+                <wp:wrapNone/>
+                <wp:docPr id="1937095733" name="Text Box 2"/>
+                <wp:cNvGraphicFramePr/>
+                <a:graphic xmlns:a="http://schemas.openxmlformats.org/drawingml/2006/main">
+                  <a:graphicData uri="http://schemas.microsoft.com/office/word/2010/wordprocessingShape">
+                    <wps:wsp>
+                      <wps:cNvSpPr txBox="1"/>
+                      <wps:spPr>
+                        <a:xfrm>
+                          <a:off x="0" y="0"/>
+                          <a:ext cx="1347293" cy="451485"/>
+                        </a:xfrm>
+                        <a:prstGeom prst="rect">
+                          <a:avLst/>
+                        </a:prstGeom>
+                        <a:noFill/>
+                        <a:ln w="6350">
+                          <a:noFill/>
+                        </a:ln>
+                      </wps:spPr>
+                      <wps:txbx>
+                        <w:txbxContent>
+                          <w:p>
+                            <w:r>
+                              <w:rPr>
+                                <w:rFonts w:ascii="Calibri" w:hAnsi="Calibri"/>
+                                <w:i/>
+                                <w:iCs/>
+                                <w:sz w:val="18"/>
+                                <w:szCs w:val="18"/>
+                                <w:lang w:val="de-CH"/>
+                              </w:rPr>
+                              <w:t>Bewerbungsdossier</w:t>
+                            </w:r>
+                            <w:r>
+                              <w:rPr>
+                                <w:rFonts w:ascii="Calibri" w:hAnsi="Calibri"/>
+                                <w:i/>
+                                <w:iCs/>
+                                <w:sz w:val="18"/>
+                                <w:szCs w:val="18"/>
+                                <w:lang w:val="de-CH"/>
+                              </w:rPr>
+                              <w:br/>
+                            </w:r>
+                            <w:r>
+                              <w:rPr>
+                                <w:rFonts w:ascii="Calibri" w:hAnsi="Calibri"/>
+                                <w:i/>
+                                <w:iCs/>
+                                <w:sz w:val="18"/>
+                                <w:szCs w:val="18"/>
+                                <w:lang w:val="de-CH"/>
+                              </w:rPr>
+                              <w:t>Passwort: Beuchat2026</w:t>
+                            </w:r>
+                          </w:p>
+                        </w:txbxContent>
+                      </wps:txbx>
+                      <wps:bodyPr rot="0" spcFirstLastPara="0" vertOverflow="overflow" horzOverflow="overflow" vert="horz" wrap="square" lIns="91440" tIns="45720" rIns="91440" bIns="45720" numCol="1" spcCol="0" rtlCol="0" fromWordArt="0" anchor="t" anchorCtr="0" forceAA="0" compatLnSpc="1">
+                        <a:prstTxWarp prst="textNoShape">
+                          <a:avLst/>
+                        </a:prstTxWarp>
+                        <a:noAutofit/>
+                      </wps:bodyPr>
+                    </wps:wsp>
+                  </a:graphicData>
+                </a:graphic>
+                <wp14:sizeRelH relativeFrom="margin">
+                  <wp14:pctWidth>0</wp14:pctWidth>
+                </wp14:sizeRelH>
+                <wp14:sizeRelV relativeFrom="margin">
+                  <wp14:pctHeight>0</wp14:pctHeight>
+                </wp14:sizeRelV>
+              </wp:anchor>
+            </w:drawing>
+          </mc:Choice>
+          <mc:Fallback>
+            <w:pict>
+              <v:shapetype w14:anchorId="007B611C" id="_x0000_t202" coordsize="21600,21600" o:spt="202" path="m,l,21600r21600,l21600,xe">
+                <v:stroke joinstyle="miter"/>
+                <v:path gradientshapeok="t" o:connecttype="rect"/>
+              </v:shapetype>
+              <v:shape id="Text Box 2" o:spid="_x0000_s1026" type="#_x0000_t202" style="position:absolute;margin-left:414.55pt;margin-top:52.25pt;width:106.1pt;height:35.55pt;z-index:251661312;visibility:visible;mso-wrap-style:square;mso-width-percent:0;mso-height-percent:0;mso-wrap-distance-left:9pt;mso-wrap-distance-top:0;mso-wrap-distance-right:9pt;mso-wrap-distance-bottom:0;mso-position-horizontal:absolute;mso-position-horizontal-relative:text;mso-position-vertical:absolute;mso-position-vertical-relative:text;mso-width-percent:0;mso-height-percent:0;mso-width-relative:margin;mso-height-relative:margin;v-text-anchor:top" o:gfxdata="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" filled="f" stroked="f" strokeweight=".5pt">
+                <v:textbox>
+                  <w:txbxContent>
+                    <w:p>
+                      <w:r>
+                        <w:rPr>
+                          <w:rFonts w:ascii="Calibri" w:hAnsi="Calibri"/>
+                          <w:i/>
+                          <w:iCs/>
+                          <w:sz w:val="18"/>
+                          <w:szCs w:val="18"/>
+                          <w:lang w:val="de-CH"/>
+                        </w:rPr>
+                        <w:t>Bewerbungsdossier</w:t>
+                      </w:r>
+                      <w:r>
+                        <w:rPr>
+                          <w:rFonts w:ascii="Calibri" w:hAnsi="Calibri"/>
+                          <w:i/>
+                          <w:iCs/>
+                          <w:sz w:val="18"/>
+                          <w:szCs w:val="18"/>
+                          <w:lang w:val="de-CH"/>
+                        </w:rPr>
+                        <w:br/>
+                      </w:r>
+                      <w:r>
+                        <w:rPr>
+                          <w:rFonts w:ascii="Calibri" w:hAnsi="Calibri"/>
+                          <w:i/>
+                          <w:iCs/>
+                          <w:sz w:val="18"/>
+                          <w:szCs w:val="18"/>
+                          <w:lang w:val="de-CH"/>
+                        </w:rPr>
+                        <w:t>Passwort: Beuchat2026</w:t>
+                      </w:r>
+                    </w:p>
+                  </w:txbxContent>
+                </v:textbox>
+              </v:shape>
+            </w:pict>
+          </mc:Fallback>
+        </mc:AlternateContent>
+      </w:r>
+      <w:r>
+        <w:rPr>
           <w:rFonts w:ascii="Calibri" w:hAnsi="Calibri"/>
+          <w:sz w:val="21"/>
+          <w:szCs w:val="21"/>
           <w:lang w:val="de-CH"/>
         </w:rPr>
         <w:t xml:space="preserve">Antoine </w:t>
@@ -587,6 +987,8 @@
       <w:r>
         <w:rPr>
           <w:rFonts w:ascii="Calibri" w:hAnsi="Calibri"/>
+          <w:sz w:val="21"/>
+          <w:szCs w:val="21"/>
           <w:lang w:val="de-CH"/>
         </w:rPr>
         <w:t>Beuchat</w:t>
@@ -594,6 +996,8 @@
       <w:proofErr w:type="spellEnd"/>
       <w:r>
         <w:rPr>
+          <w:sz w:val="21"/>
+          <w:szCs w:val="21"/>
           <w:lang w:val="de-CH"/>
         </w:rPr>
         <w:tab/>
@@ -601,6 +1005,8 @@
       <w:r>
         <w:rPr>
           <w:rFonts w:ascii="Calibri" w:hAnsi="Calibri"/>
+          <w:sz w:val="21"/>
+          <w:szCs w:val="21"/>
           <w:lang w:val="de-CH"/>
         </w:rPr>
         <w:t xml:space="preserve">Dr. med. Léa Hochstrasser </w:t>
@@ -609,6 +1015,8 @@
       <w:r>
         <w:rPr>
           <w:rFonts w:ascii="Calibri" w:hAnsi="Calibri"/>
+          <w:sz w:val="21"/>
+          <w:szCs w:val="21"/>
           <w:lang w:val="de-CH"/>
         </w:rPr>
         <w:t>Beuchat</w:t>
@@ -617,6 +1025,8 @@
       <w:r>
         <w:rPr>
           <w:rFonts w:ascii="Calibri" w:hAnsi="Calibri"/>
+          <w:sz w:val="21"/>
+          <w:szCs w:val="21"/>
           <w:lang w:val="de-CH"/>
         </w:rPr>
         <w:t xml:space="preserve"> </w:t>
@@ -624,6 +1034,8 @@
       <w:r>
         <w:rPr>
           <w:rFonts w:ascii="Calibri" w:hAnsi="Calibri"/>
+          <w:sz w:val="21"/>
+          <w:szCs w:val="21"/>
           <w:lang w:val="de-CH"/>
         </w:rPr>
         <w:tab/>
@@ -631,17 +1043,8 @@
       <w:r>
         <w:rPr>
           <w:rFonts w:ascii="Calibri" w:hAnsi="Calibri"/>
-          <w:i/>
-          <w:iCs/>
-          <w:sz w:val="20"/>
-          <w:szCs w:val="20"/>
-          <w:lang w:val="de-CH"/>
-        </w:rPr>
-        <w:t>Bewerbungsdossier</w:t>
-      </w:r>
-      <w:r>
-        <w:rPr>
-          <w:rFonts w:ascii="Calibri" w:hAnsi="Calibri"/>
+          <w:sz w:val="21"/>
+          <w:szCs w:val="21"/>
           <w:lang w:val="de-CH"/>
         </w:rPr>
         <w:tab/>
@@ -649,20 +1052,11 @@
       <w:r>
         <w:rPr>
           <w:rFonts w:ascii="Calibri" w:hAnsi="Calibri"/>
+          <w:sz w:val="21"/>
+          <w:szCs w:val="21"/>
           <w:lang w:val="de-CH"/>
         </w:rPr>
         <w:tab/>
-      </w:r>
-      <w:r>
-        <w:rPr>
-          <w:rFonts w:ascii="Calibri" w:hAnsi="Calibri"/>
-          <w:i/>
-          <w:iCs/>
-          <w:sz w:val="20"/>
-          <w:szCs w:val="20"/>
-          <w:lang w:val="de-CH"/>
-        </w:rPr>
-        <w:t>Passwort: Beuchat2026</w:t>
       </w:r>
     </w:p>
     <w:sectPr>

</xml_diff>

<commit_message>
Update cover letter PDF and Word document
Made-with: Cursor
</commit_message>
<xml_diff>
--- a/0_Cover_Letter_Beuchat.docx
+++ b/0_Cover_Letter_Beuchat.docx
@@ -376,8 +376,8 @@
         </w:tabs>
         <w:spacing w:after="120"/>
         <w:rPr>
-          <w:sz w:val="21"/>
-          <w:szCs w:val="21"/>
+          <w:sz w:val="18"/>
+          <w:szCs w:val="18"/>
           <w:lang w:val="en-CH"/>
         </w:rPr>
       </w:pPr>
@@ -411,7 +411,7 @@
           <w:szCs w:val="18"/>
           <w:lang w:val="en-CH"/>
         </w:rPr>
-        <w:instrText>https://github.com/abeuchat-ch/Dossier</w:instrText>
+        <w:instrText>https://abeuchat-ch.github.io/Dossier/</w:instrText>
       </w:r>
       <w:r>
         <w:rPr>
@@ -436,7 +436,25 @@
           <w:szCs w:val="18"/>
           <w:lang w:val="en-CH"/>
         </w:rPr>
-        <w:t>https://github.com/abeuchat-ch/Dossier</w:t>
+        <w:t>https://abeuchat-ch.github.io/</w:t>
+      </w:r>
+      <w:r>
+        <w:rPr>
+          <w:rStyle w:val="Hyperlink"/>
+          <w:sz w:val="18"/>
+          <w:szCs w:val="18"/>
+          <w:lang w:val="en-CH"/>
+        </w:rPr>
+        <w:t>D</w:t>
+      </w:r>
+      <w:r>
+        <w:rPr>
+          <w:rStyle w:val="Hyperlink"/>
+          <w:sz w:val="18"/>
+          <w:szCs w:val="18"/>
+          <w:lang w:val="en-CH"/>
+        </w:rPr>
+        <w:t>ossier/</w:t>
       </w:r>
       <w:r>
         <w:rPr>
@@ -448,8 +466,8 @@
       </w:r>
       <w:r>
         <w:rPr>
-          <w:sz w:val="21"/>
-          <w:szCs w:val="21"/>
+          <w:sz w:val="18"/>
+          <w:szCs w:val="18"/>
           <w:lang w:val="en-CH"/>
         </w:rPr>
         <w:t xml:space="preserve">, </w:t>
@@ -460,15 +478,7 @@
           <w:szCs w:val="21"/>
           <w:lang w:val="en-CH"/>
         </w:rPr>
-        <w:t>Dokumente sind aus Diskretionsgründen passwortgeschützt</w:t>
-      </w:r>
-      <w:r>
-        <w:rPr>
-          <w:sz w:val="21"/>
-          <w:szCs w:val="21"/>
-          <w:lang w:val="en-CH"/>
-        </w:rPr>
-        <w:t>.</w:t>
+        <w:t>Dokumente sind aus Diskretionsgründen passwortgeschützt.</w:t>
       </w:r>
     </w:p>
     <w:p>
@@ -543,7 +553,7 @@
         <mc:AlternateContent>
           <mc:Choice Requires="wps">
             <w:drawing>
-              <wp:anchor distT="0" distB="0" distL="114300" distR="114300" simplePos="0" relativeHeight="251657215" behindDoc="1" locked="0" layoutInCell="1" allowOverlap="1" wp14:anchorId="67A94772" wp14:editId="2CEC3D36">
+              <wp:anchor distT="0" distB="0" distL="114300" distR="114300" simplePos="0" relativeHeight="251657215" behindDoc="1" locked="0" layoutInCell="1" allowOverlap="1" wp14:anchorId="67A94772" wp14:editId="3AA57952">
                 <wp:simplePos x="0" y="0"/>
                 <wp:positionH relativeFrom="column">
                   <wp:posOffset>5168900</wp:posOffset>
@@ -611,7 +621,7 @@
           </mc:Choice>
           <mc:Fallback>
             <w:pict>
-              <v:rect w14:anchorId="3A475115" id="Rectangle 3" o:spid="_x0000_s1026" style="position:absolute;margin-left:407pt;margin-top:12.4pt;width:113.8pt;height:137.45pt;z-index:-251659265;visibility:visible;mso-wrap-style:square;mso-width-percent:0;mso-height-percent:0;mso-wrap-distance-left:9pt;mso-wrap-distance-top:0;mso-wrap-distance-right:9pt;mso-wrap-distance-bottom:0;mso-position-horizontal:absolute;mso-position-horizontal-relative:text;mso-position-vertical:absolute;mso-position-vertical-relative:text;mso-width-percent:0;mso-height-percent:0;mso-width-relative:margin;mso-height-relative:margin;v-text-anchor:middle" o:gfxdata="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" fillcolor="#d8d8d8 [2732]" stroked="f">
+              <v:rect w14:anchorId="2D7C6FD0" id="Rectangle 3" o:spid="_x0000_s1026" style="position:absolute;margin-left:407pt;margin-top:12.4pt;width:113.8pt;height:137.45pt;z-index:-251659265;visibility:visible;mso-wrap-style:square;mso-width-percent:0;mso-height-percent:0;mso-wrap-distance-left:9pt;mso-wrap-distance-top:0;mso-wrap-distance-right:9pt;mso-wrap-distance-bottom:0;mso-position-horizontal:absolute;mso-position-horizontal-relative:text;mso-position-vertical:absolute;mso-position-vertical-relative:text;mso-width-percent:0;mso-height-percent:0;mso-width-relative:margin;mso-height-relative:margin;v-text-anchor:middle" o:gfxdata="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" fillcolor="#d8d8d8 [2732]" stroked="f">
                 <v:shadow on="t" color="black" opacity="22937f" origin=",.5" offset="0,.63889mm"/>
               </v:rect>
             </w:pict>
@@ -744,24 +754,27 @@
       </w:pPr>
       <w:r>
         <w:rPr>
+          <w:rFonts w:ascii="Calibri" w:hAnsi="Calibri"/>
+          <w:i/>
+          <w:iCs/>
           <w:noProof/>
-          <w:sz w:val="21"/>
-          <w:szCs w:val="21"/>
+          <w:sz w:val="18"/>
+          <w:szCs w:val="18"/>
           <w:lang w:val="de-CH"/>
         </w:rPr>
         <w:drawing>
-          <wp:anchor distT="0" distB="0" distL="114300" distR="114300" simplePos="0" relativeHeight="251658240" behindDoc="1" locked="0" layoutInCell="1" allowOverlap="1" wp14:anchorId="5D41F9A3" wp14:editId="3DA33C15">
+          <wp:anchor distT="0" distB="0" distL="114300" distR="114300" simplePos="0" relativeHeight="251662336" behindDoc="1" locked="0" layoutInCell="1" allowOverlap="1" wp14:anchorId="1383D49F" wp14:editId="1DDA9154">
             <wp:simplePos x="0" y="0"/>
             <wp:positionH relativeFrom="column">
-              <wp:posOffset>5344160</wp:posOffset>
+              <wp:posOffset>5365750</wp:posOffset>
             </wp:positionH>
             <wp:positionV relativeFrom="paragraph">
-              <wp:posOffset>76200</wp:posOffset>
+              <wp:posOffset>56515</wp:posOffset>
             </wp:positionV>
             <wp:extent cx="1079500" cy="1079500"/>
             <wp:effectExtent l="0" t="0" r="0" b="0"/>
             <wp:wrapNone/>
-            <wp:docPr id="966161522" name="Picture 1" descr="A qr code on a white background&#10;&#10;Description automatically generated"/>
+            <wp:docPr id="1094795550" name="Picture 3" descr="A qr code on a white background&#10;&#10;Description automatically generated"/>
             <wp:cNvGraphicFramePr>
               <a:graphicFrameLocks xmlns:a="http://schemas.openxmlformats.org/drawingml/2006/main" noChangeAspect="1"/>
             </wp:cNvGraphicFramePr>
@@ -769,7 +782,7 @@
               <a:graphicData uri="http://schemas.openxmlformats.org/drawingml/2006/picture">
                 <pic:pic xmlns:pic="http://schemas.openxmlformats.org/drawingml/2006/picture">
                   <pic:nvPicPr>
-                    <pic:cNvPr id="966161522" name="Picture 1" descr="A qr code on a white background&#10;&#10;Description automatically generated"/>
+                    <pic:cNvPr id="1094795550" name="Picture 3" descr="A qr code on a white background&#10;&#10;Description automatically generated"/>
                     <pic:cNvPicPr/>
                   </pic:nvPicPr>
                   <pic:blipFill>
@@ -790,10 +803,10 @@
                 </pic:pic>
               </a:graphicData>
             </a:graphic>
-            <wp14:sizeRelH relativeFrom="margin">
+            <wp14:sizeRelH relativeFrom="page">
               <wp14:pctWidth>0</wp14:pctWidth>
             </wp14:sizeRelH>
-            <wp14:sizeRelV relativeFrom="margin">
+            <wp14:sizeRelV relativeFrom="page">
               <wp14:pctHeight>0</wp14:pctHeight>
             </wp14:sizeRelV>
           </wp:anchor>
@@ -1875,6 +1888,7 @@
   <w:style w:type="character" w:default="1" w:styleId="DefaultParagraphFont">
     <w:name w:val="Default Paragraph Font"/>
     <w:uiPriority w:val="1"/>
+    <w:semiHidden/>
     <w:unhideWhenUsed/>
   </w:style>
   <w:style w:type="table" w:default="1" w:styleId="TableNormal">
@@ -12672,6 +12686,18 @@
     <w:rPr>
       <w:color w:val="605E5C"/>
       <w:shd w:val="clear" w:color="auto" w:fill="E1DFDD"/>
+    </w:rPr>
+  </w:style>
+  <w:style w:type="character" w:styleId="FollowedHyperlink">
+    <w:name w:val="FollowedHyperlink"/>
+    <w:basedOn w:val="DefaultParagraphFont"/>
+    <w:uiPriority w:val="99"/>
+    <w:semiHidden/>
+    <w:unhideWhenUsed/>
+    <w:rsid w:val="00377B04"/>
+    <w:rPr>
+      <w:color w:val="800080" w:themeColor="followedHyperlink"/>
+      <w:u w:val="single"/>
     </w:rPr>
   </w:style>
 </w:styles>

</xml_diff>